<commit_message>
This area needs to be updated with the new code found in the Client DB version. change to "Melmark’s Follow Up Responsibility" Word footer,Word Header change List 19 Task #26,* FaceSheet: Opening the Word document exported from the Biweekly module throws the warning message List 19 Task #31
</commit_message>
<xml_diff>
--- a/Administration/FacesheetNE/Facesheet NA.docx
+++ b/Administration/FacesheetNE/Facesheet NA.docx
@@ -676,9 +676,6 @@
               <w:pStyle w:val="18"/>
             </w:pPr>
             <w:r>
-              <w:rPr>
-                <w:lang w:val="en-US" w:eastAsia="en-US"/>
-              </w:rPr>
               <w:t>Picture Date taken</w:t>
             </w:r>
           </w:p>
@@ -700,17 +697,11 @@
               <w:pStyle w:val="18"/>
             </w:pPr>
             <w:r>
-              <w:rPr>
-                <w:i/>
-                <w:lang w:val="en-US" w:eastAsia="en-US"/>
-              </w:rPr>
               <w:t>plc</w:t>
             </w:r>
             <w:r>
               <w:rPr>
-                <w:rFonts w:hint="default"/>
-                <w:i/>
-                <w:lang w:val="en-IN" w:eastAsia="en-US"/>
+                <w:lang w:val="en-IN"/>
               </w:rPr>
               <w:t>Photodate</w:t>
             </w:r>
@@ -781,8 +772,8 @@
             <w:tcBorders>
               <w:top w:val="single" w:color="auto" w:sz="4" w:space="0"/>
               <w:left w:val="single" w:color="auto" w:sz="4" w:space="0"/>
-              <w:bottom w:val="nil"/>
-              <w:right w:val="nil"/>
+              <w:bottom w:val="single" w:color="D8D8D8" w:themeColor="background1" w:themeShade="D9" w:sz="4" w:space="0"/>
+              <w:right w:val="single" w:color="D8D8D8" w:themeColor="background1" w:themeShade="D9" w:sz="4" w:space="0"/>
             </w:tcBorders>
             <w:vAlign w:val="center"/>
           </w:tcPr>
@@ -800,9 +791,9 @@
             <w:tcW w:w="1945" w:type="dxa"/>
             <w:tcBorders>
               <w:top w:val="single" w:color="auto" w:sz="4" w:space="0"/>
-              <w:left w:val="nil"/>
-              <w:bottom w:val="nil"/>
-              <w:right w:val="nil"/>
+              <w:left w:val="single" w:color="D8D8D8" w:themeColor="background1" w:themeShade="D9" w:sz="4" w:space="0"/>
+              <w:bottom w:val="single" w:color="D8D8D8" w:themeColor="background1" w:themeShade="D9" w:sz="4" w:space="0"/>
+              <w:right w:val="single" w:color="7F7F7F" w:themeColor="background1" w:themeShade="80" w:sz="4" w:space="0"/>
             </w:tcBorders>
             <w:vAlign w:val="center"/>
           </w:tcPr>
@@ -827,7 +818,7 @@
             <w:tcW w:w="3058" w:type="dxa"/>
             <w:tcBorders>
               <w:top w:val="single" w:color="C0C0C0" w:sz="4" w:space="0"/>
-              <w:left w:val="nil"/>
+              <w:left w:val="single" w:color="7F7F7F" w:themeColor="background1" w:themeShade="80" w:sz="4" w:space="0"/>
               <w:bottom w:val="single" w:color="C0C0C0" w:sz="4" w:space="0"/>
               <w:right w:val="single" w:color="C0C0C0" w:sz="4" w:space="0"/>
             </w:tcBorders>
@@ -885,7 +876,7 @@
             <w:tcW w:w="2592" w:type="dxa"/>
             <w:gridSpan w:val="2"/>
             <w:tcBorders>
-              <w:top w:val="nil"/>
+              <w:top w:val="single" w:color="D8D8D8" w:themeColor="background1" w:themeShade="D9" w:sz="4" w:space="0"/>
               <w:bottom w:val="single" w:color="C0C0C0" w:sz="4" w:space="0"/>
               <w:right w:val="single" w:color="C0C0C0" w:sz="4" w:space="0"/>
             </w:tcBorders>
@@ -904,7 +895,7 @@
           <w:tcPr>
             <w:tcW w:w="1945" w:type="dxa"/>
             <w:tcBorders>
-              <w:top w:val="nil"/>
+              <w:top w:val="single" w:color="D8D8D8" w:themeColor="background1" w:themeShade="D9" w:sz="4" w:space="0"/>
               <w:left w:val="single" w:color="C0C0C0" w:sz="4" w:space="0"/>
               <w:bottom w:val="single" w:color="C0C0C0" w:sz="4" w:space="0"/>
               <w:right w:val="single" w:color="999999" w:sz="4" w:space="0"/>
@@ -925,8 +916,6 @@
               </w:rPr>
               <w:t>plcHeight</w:t>
             </w:r>
-            <w:bookmarkStart w:id="0" w:name="_GoBack"/>
-            <w:bookmarkEnd w:id="0"/>
           </w:p>
         </w:tc>
         <w:tc>
@@ -980,6 +969,12 @@
             <w:insideH w:val="none" w:color="auto" w:sz="0" w:space="0"/>
             <w:insideV w:val="none" w:color="auto" w:sz="0" w:space="0"/>
           </w:tblBorders>
+          <w:tblCellMar>
+            <w:top w:w="0" w:type="dxa"/>
+            <w:left w:w="108" w:type="dxa"/>
+            <w:bottom w:w="0" w:type="dxa"/>
+            <w:right w:w="108" w:type="dxa"/>
+          </w:tblCellMar>
         </w:tblPrEx>
         <w:tc>
           <w:tcPr>
@@ -1555,9 +1550,6 @@
             <w:right w:w="108" w:type="dxa"/>
           </w:tblCellMar>
         </w:tblPrEx>
-        <w:trPr>
-          <w:trHeight w:val="292" w:hRule="atLeast"/>
-        </w:trPr>
         <w:tc>
           <w:tcPr>
             <w:tcW w:w="4537" w:type="dxa"/>
@@ -1571,13 +1563,28 @@
           </w:tcPr>
           <w:p>
             <w:pPr>
-              <w:pStyle w:val="14"/>
-              <w:rPr>
-                <w:szCs w:val="20"/>
-              </w:rPr>
-            </w:pPr>
-            <w:r>
-              <w:t>Primary Nurse</w:t>
+              <w:pStyle w:val="20"/>
+              <w:keepNext/>
+              <w:rPr>
+                <w:rFonts w:ascii="Arial" w:hAnsi="Arial" w:cs="Arial"/>
+                <w:b/>
+                <w:sz w:val="20"/>
+              </w:rPr>
+            </w:pPr>
+            <w:r>
+              <w:rPr>
+                <w:rFonts w:ascii="Arial" w:hAnsi="Arial" w:cs="Arial"/>
+                <w:b/>
+                <w:sz w:val="20"/>
+              </w:rPr>
+              <w:t xml:space="preserve">Educational Surrogate: </w:t>
+            </w:r>
+            <w:r>
+              <w:rPr>
+                <w:rFonts w:ascii="Arial" w:hAnsi="Arial" w:cs="Arial"/>
+                <w:sz w:val="20"/>
+              </w:rPr>
+              <w:t>(if applicable)</w:t>
             </w:r>
           </w:p>
         </w:tc>
@@ -1594,20 +1601,18 @@
           </w:tcPr>
           <w:p>
             <w:pPr>
-              <w:pStyle w:val="14"/>
-              <w:rPr>
-                <w:rFonts w:ascii="Times New Roman" w:hAnsi="Times New Roman" w:cs="Times New Roman"/>
-                <w:b w:val="0"/>
-                <w:szCs w:val="20"/>
-              </w:rPr>
-            </w:pPr>
-            <w:r>
-              <w:rPr>
-                <w:rFonts w:ascii="Times New Roman" w:hAnsi="Times New Roman" w:cs="Times New Roman"/>
-                <w:b w:val="0"/>
-                <w:szCs w:val="20"/>
-              </w:rPr>
-              <w:t>Eglantine Ranoux, RN, BSN</w:t>
+              <w:pStyle w:val="20"/>
+              <w:keepNext/>
+              <w:rPr>
+                <w:sz w:val="20"/>
+              </w:rPr>
+            </w:pPr>
+            <w:r>
+              <w:rPr>
+                <w:sz w:val="20"/>
+                <w:lang w:val="en-IN"/>
+              </w:rPr>
+              <w:t>plcEducationalSurrogate</w:t>
             </w:r>
           </w:p>
         </w:tc>
@@ -1635,7 +1640,7 @@
             <w:gridSpan w:val="3"/>
             <w:tcBorders>
               <w:top w:val="single" w:color="999999" w:sz="4" w:space="0"/>
-              <w:bottom w:val="single" w:color="auto" w:sz="4" w:space="0"/>
+              <w:bottom w:val="single" w:color="999999" w:sz="4" w:space="0"/>
               <w:right w:val="single" w:color="999999" w:sz="4" w:space="0"/>
             </w:tcBorders>
             <w:vAlign w:val="center"/>
@@ -1652,18 +1657,107 @@
             </w:pPr>
             <w:r>
               <w:rPr>
+                <w:rFonts w:hint="default" w:ascii="Arial" w:hAnsi="Arial" w:eastAsia="SimSun" w:cs="Arial"/>
+                <w:b/>
+                <w:bCs/>
+                <w:i w:val="0"/>
+                <w:iCs w:val="0"/>
+                <w:caps w:val="0"/>
+                <w:color w:val="000000"/>
+                <w:spacing w:val="0"/>
+                <w:sz w:val="20"/>
+                <w:szCs w:val="20"/>
+                <w:shd w:val="clear" w:fill="FFFFFF"/>
+              </w:rPr>
+              <w:t>Primary Nurse</w:t>
+            </w:r>
+          </w:p>
+        </w:tc>
+        <w:tc>
+          <w:tcPr>
+            <w:tcW w:w="6083" w:type="dxa"/>
+            <w:gridSpan w:val="2"/>
+            <w:tcBorders>
+              <w:top w:val="single" w:color="999999" w:sz="4" w:space="0"/>
+              <w:left w:val="single" w:color="999999" w:sz="4" w:space="0"/>
+              <w:bottom w:val="single" w:color="999999" w:sz="4" w:space="0"/>
+            </w:tcBorders>
+            <w:vAlign w:val="center"/>
+          </w:tcPr>
+          <w:p>
+            <w:pPr>
+              <w:pStyle w:val="20"/>
+              <w:keepNext/>
+              <w:rPr>
+                <w:rFonts w:hint="default"/>
+                <w:sz w:val="20"/>
+                <w:lang w:val="en-US"/>
+              </w:rPr>
+            </w:pPr>
+            <w:r>
+              <w:rPr>
+                <w:rFonts w:hint="default"/>
+                <w:sz w:val="20"/>
+                <w:lang w:val="en-US"/>
+              </w:rPr>
+              <w:t>plcPrimaryNurse</w:t>
+            </w:r>
+          </w:p>
+        </w:tc>
+      </w:tr>
+      <w:tr>
+        <w:tblPrEx>
+          <w:tblBorders>
+            <w:top w:val="single" w:color="auto" w:sz="4" w:space="0"/>
+            <w:left w:val="single" w:color="auto" w:sz="4" w:space="0"/>
+            <w:bottom w:val="single" w:color="auto" w:sz="4" w:space="0"/>
+            <w:right w:val="single" w:color="auto" w:sz="4" w:space="0"/>
+            <w:insideH w:val="none" w:color="auto" w:sz="0" w:space="0"/>
+            <w:insideV w:val="none" w:color="auto" w:sz="0" w:space="0"/>
+          </w:tblBorders>
+          <w:tblCellMar>
+            <w:top w:w="0" w:type="dxa"/>
+            <w:left w:w="108" w:type="dxa"/>
+            <w:bottom w:w="0" w:type="dxa"/>
+            <w:right w:w="108" w:type="dxa"/>
+          </w:tblCellMar>
+        </w:tblPrEx>
+        <w:tc>
+          <w:tcPr>
+            <w:tcW w:w="4537" w:type="dxa"/>
+            <w:gridSpan w:val="3"/>
+            <w:tcBorders>
+              <w:top w:val="single" w:color="999999" w:sz="4" w:space="0"/>
+              <w:bottom w:val="single" w:color="auto" w:sz="4" w:space="0"/>
+              <w:right w:val="single" w:color="999999" w:sz="4" w:space="0"/>
+            </w:tcBorders>
+            <w:vAlign w:val="center"/>
+          </w:tcPr>
+          <w:p>
+            <w:pPr>
+              <w:pStyle w:val="20"/>
+              <w:keepNext/>
+              <w:rPr>
                 <w:rFonts w:ascii="Arial" w:hAnsi="Arial" w:cs="Arial"/>
                 <w:b/>
                 <w:sz w:val="20"/>
               </w:rPr>
-              <w:t xml:space="preserve">Educational Surrogate: </w:t>
-            </w:r>
-            <w:r>
-              <w:rPr>
-                <w:rFonts w:ascii="Arial" w:hAnsi="Arial" w:cs="Arial"/>
+            </w:pPr>
+            <w:r>
+              <w:rPr>
+                <w:rFonts w:hint="default" w:ascii="Arial" w:hAnsi="Arial" w:eastAsia="SimSun" w:cs="Arial"/>
+                <w:b/>
+                <w:bCs/>
+                <w:i w:val="0"/>
+                <w:iCs w:val="0"/>
+                <w:caps w:val="0"/>
+                <w:color w:val="000000"/>
+                <w:spacing w:val="0"/>
                 <w:sz w:val="20"/>
-              </w:rPr>
-              <w:t>(if applicable)</w:t>
+                <w:szCs w:val="20"/>
+                <w:shd w:val="clear" w:fill="FFFFFF"/>
+              </w:rPr>
+              <w:t>Wellness Check Status</w:t>
             </w:r>
           </w:p>
         </w:tc>
@@ -1683,15 +1777,36 @@
               <w:pStyle w:val="20"/>
               <w:keepNext/>
               <w:rPr>
+                <w:rFonts w:hint="default"/>
                 <w:sz w:val="20"/>
-              </w:rPr>
-            </w:pPr>
-            <w:r>
-              <w:rPr>
+                <w:lang w:val="en-US"/>
+              </w:rPr>
+            </w:pPr>
+            <w:r>
+              <w:rPr>
+                <w:rFonts w:hint="default" w:ascii="Times New Roman" w:hAnsi="Times New Roman" w:cs="Times New Roman"/>
+                <w:b w:val="0"/>
+                <w:bCs w:val="0"/>
                 <w:sz w:val="20"/>
-                <w:lang w:val="en-IN"/>
-              </w:rPr>
-              <w:t>plcEducationalSurrogate</w:t>
+                <w:lang w:val="en-US"/>
+              </w:rPr>
+              <w:t>plc</w:t>
+            </w:r>
+            <w:r>
+              <w:rPr>
+                <w:rFonts w:hint="default" w:ascii="Times New Roman" w:hAnsi="Times New Roman" w:eastAsia="SimSun" w:cs="Times New Roman"/>
+                <w:b w:val="0"/>
+                <w:bCs w:val="0"/>
+                <w:i w:val="0"/>
+                <w:iCs w:val="0"/>
+                <w:caps w:val="0"/>
+                <w:color w:val="000000"/>
+                <w:spacing w:val="0"/>
+                <w:sz w:val="20"/>
+                <w:szCs w:val="20"/>
+                <w:shd w:val="clear" w:fill="FFFFFF"/>
+              </w:rPr>
+              <w:t>WellnessCheckStatus</w:t>
             </w:r>
           </w:p>
         </w:tc>
@@ -5450,6 +5565,12 @@
             <w:insideH w:val="single" w:color="999999" w:sz="4" w:space="0"/>
             <w:insideV w:val="none" w:color="auto" w:sz="0" w:space="0"/>
           </w:tblBorders>
+          <w:tblCellMar>
+            <w:top w:w="0" w:type="dxa"/>
+            <w:left w:w="108" w:type="dxa"/>
+            <w:bottom w:w="0" w:type="dxa"/>
+            <w:right w:w="108" w:type="dxa"/>
+          </w:tblCellMar>
         </w:tblPrEx>
         <w:tc>
           <w:tcPr>
@@ -5849,6 +5970,12 @@
             <w:insideH w:val="none" w:color="auto" w:sz="0" w:space="0"/>
             <w:insideV w:val="none" w:color="auto" w:sz="0" w:space="0"/>
           </w:tblBorders>
+          <w:tblCellMar>
+            <w:top w:w="0" w:type="dxa"/>
+            <w:left w:w="108" w:type="dxa"/>
+            <w:bottom w:w="0" w:type="dxa"/>
+            <w:right w:w="108" w:type="dxa"/>
+          </w:tblCellMar>
         </w:tblPrEx>
         <w:tc>
           <w:tcPr>
@@ -6207,6 +6334,12 @@
             <w:insideH w:val="single" w:color="999999" w:sz="4" w:space="0"/>
             <w:insideV w:val="none" w:color="auto" w:sz="0" w:space="0"/>
           </w:tblBorders>
+          <w:tblCellMar>
+            <w:top w:w="0" w:type="dxa"/>
+            <w:left w:w="108" w:type="dxa"/>
+            <w:bottom w:w="0" w:type="dxa"/>
+            <w:right w:w="108" w:type="dxa"/>
+          </w:tblCellMar>
         </w:tblPrEx>
         <w:tc>
           <w:tcPr>
@@ -6309,6 +6442,12 @@
             <w:insideH w:val="single" w:color="999999" w:sz="4" w:space="0"/>
             <w:insideV w:val="none" w:color="auto" w:sz="0" w:space="0"/>
           </w:tblBorders>
+          <w:tblCellMar>
+            <w:top w:w="0" w:type="dxa"/>
+            <w:left w:w="108" w:type="dxa"/>
+            <w:bottom w:w="0" w:type="dxa"/>
+            <w:right w:w="108" w:type="dxa"/>
+          </w:tblCellMar>
         </w:tblPrEx>
         <w:tc>
           <w:tcPr>
@@ -6894,7 +7033,7 @@
               <w:pStyle w:val="14"/>
             </w:pPr>
             <w:r>
-              <w:t>Melmark New England’s Follow Up Responsibility</w:t>
+              <w:t>Melmark’s Follow Up Responsibility</w:t>
             </w:r>
           </w:p>
         </w:tc>
@@ -6926,12 +7065,6 @@
       <w:footerReference r:id="rId5" w:type="default"/>
       <w:pgSz w:w="12240" w:h="15840"/>
       <w:pgMar w:top="720" w:right="720" w:bottom="720" w:left="720" w:header="720" w:footer="548" w:gutter="0"/>
-      <w:pgBorders>
-        <w:top w:val="none" w:sz="0" w:space="0"/>
-        <w:left w:val="none" w:sz="0" w:space="0"/>
-        <w:bottom w:val="none" w:sz="0" w:space="0"/>
-        <w:right w:val="none" w:sz="0" w:space="0"/>
-      </w:pgBorders>
       <w:cols w:space="720" w:num="1"/>
       <w:titlePg/>
       <w:docGrid w:linePitch="360" w:charSpace="0"/>
@@ -6942,14 +7075,6 @@
 
 <file path=word/footer1.xml><?xml version="1.0" encoding="utf-8"?>
 <w:ftr xmlns:wpc="http://schemas.microsoft.com/office/word/2010/wordprocessingCanvas" xmlns:mc="http://schemas.openxmlformats.org/markup-compatibility/2006" xmlns:o="urn:schemas-microsoft-com:office:office" xmlns:r="http://schemas.openxmlformats.org/officeDocument/2006/relationships" xmlns:m="http://schemas.openxmlformats.org/officeDocument/2006/math" xmlns:v="urn:schemas-microsoft-com:vml" xmlns:wp14="http://schemas.microsoft.com/office/word/2010/wordprocessingDrawing" xmlns:wp="http://schemas.openxmlformats.org/drawingml/2006/wordprocessingDrawing" xmlns:w10="urn:schemas-microsoft-com:office:word" xmlns:w="http://schemas.openxmlformats.org/wordprocessingml/2006/main" xmlns:w14="http://schemas.microsoft.com/office/word/2010/wordml" xmlns:w15="http://schemas.microsoft.com/office/word/2012/wordml" xmlns:wpg="http://schemas.microsoft.com/office/word/2010/wordprocessingGroup" xmlns:wpi="http://schemas.microsoft.com/office/word/2010/wordprocessingInk" xmlns:wne="http://schemas.microsoft.com/office/word/2006/wordml" xmlns:wps="http://schemas.microsoft.com/office/word/2010/wordprocessingShape" xmlns:wpsCustomData="http://www.wps.cn/officeDocument/2013/wpsCustomData" mc:Ignorable="w14 w15 wp14">
-  <w:p>
-    <w:pPr>
-      <w:pStyle w:val="9"/>
-      <w:rPr>
-        <w:color w:val="000000"/>
-      </w:rPr>
-    </w:pPr>
-  </w:p>
   <w:p>
     <w:pPr>
       <w:pStyle w:val="9"/>
@@ -6970,47 +7095,49 @@
         <w:sz w:val="12"/>
         <w:szCs w:val="12"/>
       </w:rPr>
-      <w:fldChar w:fldCharType="begin"/>
+      <w:tab/>
     </w:r>
+  </w:p>
+  <w:p>
+    <w:pPr>
+      <w:pStyle w:val="9"/>
+      <w:tabs>
+        <w:tab w:val="right" w:pos="10800"/>
+        <w:tab w:val="clear" w:pos="4320"/>
+        <w:tab w:val="clear" w:pos="8640"/>
+      </w:tabs>
+      <w:rPr>
+        <w:rFonts w:hint="default" w:ascii="Arial" w:hAnsi="Arial" w:cs="Arial"/>
+        <w:sz w:val="12"/>
+        <w:szCs w:val="12"/>
+        <w:lang w:val="en-US"/>
+      </w:rPr>
+    </w:pPr>
     <w:r>
       <w:rPr>
         <w:rFonts w:ascii="Arial" w:hAnsi="Arial" w:cs="Arial"/>
         <w:sz w:val="12"/>
         <w:szCs w:val="12"/>
       </w:rPr>
-      <w:instrText xml:space="preserve"> FILENAME \p </w:instrText>
+      <w:t>© Melmark Inc. 2005,2026.  May not be used without written permission.</w:t>
     </w:r>
     <w:r>
       <w:rPr>
-        <w:rFonts w:ascii="Arial" w:hAnsi="Arial" w:cs="Arial"/>
+        <w:rFonts w:hint="default" w:ascii="Arial" w:hAnsi="Arial" w:cs="Arial"/>
         <w:sz w:val="12"/>
         <w:szCs w:val="12"/>
+        <w:lang w:val="en-US"/>
       </w:rPr>
-      <w:fldChar w:fldCharType="separate"/>
+      <w:tab/>
     </w:r>
     <w:r>
       <w:rPr>
-        <w:rFonts w:ascii="Arial" w:hAnsi="Arial" w:cs="Arial"/>
+        <w:rFonts w:hint="default" w:ascii="Arial" w:hAnsi="Arial" w:cs="Arial"/>
         <w:sz w:val="12"/>
         <w:szCs w:val="12"/>
+        <w:lang w:val="en-US"/>
       </w:rPr>
-      <w:t>S:\SA\DeMasiP - 00328\Educational\Facesheet\DeMasi, P FaceSheet 1.8.21.doc</w:t>
-    </w:r>
-    <w:r>
-      <w:rPr>
-        <w:rFonts w:ascii="Arial" w:hAnsi="Arial" w:cs="Arial"/>
-        <w:sz w:val="12"/>
-        <w:szCs w:val="12"/>
-      </w:rPr>
-      <w:fldChar w:fldCharType="end"/>
-    </w:r>
-    <w:r>
-      <w:rPr>
-        <w:rFonts w:ascii="Arial" w:hAnsi="Arial" w:cs="Arial"/>
-        <w:sz w:val="12"/>
-        <w:szCs w:val="12"/>
-      </w:rPr>
-      <w:tab/>
+      <w:t xml:space="preserve">                                                                                                                                                  </w:t>
     </w:r>
     <w:r>
       <w:rPr>
@@ -7034,7 +7161,7 @@
         <w:sz w:val="12"/>
         <w:szCs w:val="12"/>
       </w:rPr>
-      <w:instrText xml:space="preserve"> DATE \@ "M/d/yyyy" </w:instrText>
+      <w:instrText xml:space="preserve"> DATE \@ "M/d/yyyy"</w:instrText>
     </w:r>
     <w:r>
       <w:rPr>
@@ -7050,7 +7177,7 @@
         <w:sz w:val="12"/>
         <w:szCs w:val="12"/>
       </w:rPr>
-      <w:t>3/16/2022</w:t>
+      <w:t>5/6/2026</w:t>
     </w:r>
     <w:r>
       <w:rPr>
@@ -7060,80 +7187,14 @@
       </w:rPr>
       <w:fldChar w:fldCharType="end"/>
     </w:r>
-  </w:p>
-  <w:p>
-    <w:pPr>
-      <w:pStyle w:val="9"/>
-      <w:tabs>
-        <w:tab w:val="right" w:pos="10800"/>
-        <w:tab w:val="clear" w:pos="8640"/>
-      </w:tabs>
+    <w:r>
       <w:rPr>
-        <w:rFonts w:ascii="Arial" w:hAnsi="Arial" w:cs="Arial"/>
+        <w:rFonts w:hint="default" w:ascii="Arial" w:hAnsi="Arial" w:cs="Arial"/>
         <w:sz w:val="12"/>
         <w:szCs w:val="12"/>
-      </w:rPr>
-    </w:pPr>
-    <w:r>
-      <w:rPr>
-        <w:rFonts w:ascii="Arial" w:hAnsi="Arial" w:cs="Arial"/>
-        <w:sz w:val="12"/>
-        <w:szCs w:val="12"/>
-      </w:rPr>
-      <w:t>© Melmark New England Inc. 2005.  May not be used without written permission.</w:t>
-    </w:r>
-    <w:r>
-      <w:t xml:space="preserve"> </w:t>
-    </w:r>
-    <w:r>
-      <w:tab/>
-    </w:r>
-    <w:r>
-      <w:rPr>
-        <w:rFonts w:ascii="Arial" w:hAnsi="Arial" w:cs="Arial"/>
-        <w:sz w:val="12"/>
-        <w:szCs w:val="12"/>
-      </w:rPr>
-      <w:t>t6v2 5.05</w:t>
-    </w:r>
-  </w:p>
-  <w:p>
-    <w:pPr>
-      <w:pStyle w:val="9"/>
-      <w:pBdr>
-        <w:top w:val="thickThinSmallGap" w:color="auto" w:sz="24" w:space="1"/>
-      </w:pBdr>
-      <w:tabs>
-        <w:tab w:val="right" w:pos="10800"/>
-        <w:tab w:val="clear" w:pos="8640"/>
-      </w:tabs>
-      <w:rPr>
-        <w:rFonts w:ascii="Arial" w:hAnsi="Arial" w:cs="Arial"/>
-      </w:rPr>
-    </w:pPr>
-    <w:r>
-      <w:rPr>
-        <w:rFonts w:ascii="Arial" w:hAnsi="Arial" w:cs="Arial"/>
-      </w:rPr>
-      <w:t>461 River Rd. | Andover, MA | 01810</w:t>
-    </w:r>
-    <w:r>
-      <w:rPr>
-        <w:rFonts w:ascii="Arial" w:hAnsi="Arial" w:cs="Arial"/>
+        <w:lang w:val="en-US"/>
       </w:rPr>
       <w:tab/>
-    </w:r>
-    <w:r>
-      <w:rPr>
-        <w:rFonts w:ascii="Arial" w:hAnsi="Arial" w:cs="Arial"/>
-      </w:rPr>
-      <w:tab/>
-    </w:r>
-    <w:r>
-      <w:rPr>
-        <w:rFonts w:ascii="Arial" w:hAnsi="Arial" w:cs="Arial"/>
-      </w:rPr>
-      <w:t xml:space="preserve">(978) 654- 4300 </w:t>
     </w:r>
   </w:p>
   <w:p>
@@ -7151,12 +7212,6 @@
       <w:rPr>
         <w:rFonts w:ascii="Arial" w:hAnsi="Arial" w:cs="Arial"/>
       </w:rPr>
-      <w:t>www.melmarkne.org</w:t>
-    </w:r>
-    <w:r>
-      <w:rPr>
-        <w:rFonts w:ascii="Arial" w:hAnsi="Arial" w:cs="Arial"/>
-      </w:rPr>
       <w:tab/>
     </w:r>
     <w:r>
@@ -7165,342 +7220,120 @@
       </w:rPr>
       <w:tab/>
     </w:r>
-    <w:r>
-      <w:rPr>
-        <w:rFonts w:ascii="Arial" w:hAnsi="Arial" w:cs="Arial"/>
-      </w:rPr>
-      <w:t>(978) 654- 4315 fax</w:t>
-    </w:r>
   </w:p>
 </w:ftr>
 </file>
 
 <file path=word/footer2.xml><?xml version="1.0" encoding="utf-8"?>
 <w:ftr xmlns:wpc="http://schemas.microsoft.com/office/word/2010/wordprocessingCanvas" xmlns:mc="http://schemas.openxmlformats.org/markup-compatibility/2006" xmlns:o="urn:schemas-microsoft-com:office:office" xmlns:r="http://schemas.openxmlformats.org/officeDocument/2006/relationships" xmlns:m="http://schemas.openxmlformats.org/officeDocument/2006/math" xmlns:v="urn:schemas-microsoft-com:vml" xmlns:wp14="http://schemas.microsoft.com/office/word/2010/wordprocessingDrawing" xmlns:wp="http://schemas.openxmlformats.org/drawingml/2006/wordprocessingDrawing" xmlns:w10="urn:schemas-microsoft-com:office:word" xmlns:w="http://schemas.openxmlformats.org/wordprocessingml/2006/main" xmlns:w14="http://schemas.microsoft.com/office/word/2010/wordml" xmlns:w15="http://schemas.microsoft.com/office/word/2012/wordml" xmlns:wpg="http://schemas.microsoft.com/office/word/2010/wordprocessingGroup" xmlns:wpi="http://schemas.microsoft.com/office/word/2010/wordprocessingInk" xmlns:wne="http://schemas.microsoft.com/office/word/2006/wordml" xmlns:wps="http://schemas.microsoft.com/office/word/2010/wordprocessingShape" xmlns:wpsCustomData="http://www.wps.cn/officeDocument/2013/wpsCustomData" mc:Ignorable="w14 w15 wp14">
-  <w:tbl>
-    <w:tblPr>
-      <w:tblStyle w:val="6"/>
-      <w:tblpPr w:leftFromText="180" w:rightFromText="180" w:vertAnchor="page" w:horzAnchor="page" w:tblpX="818" w:tblpY="14243"/>
-      <w:tblOverlap w:val="never"/>
-      <w:tblW w:w="0" w:type="auto"/>
-      <w:tblInd w:w="0" w:type="dxa"/>
-      <w:tblBorders>
-        <w:top w:val="none" w:color="auto" w:sz="0" w:space="0"/>
-        <w:left w:val="none" w:color="auto" w:sz="0" w:space="0"/>
-        <w:bottom w:val="none" w:color="auto" w:sz="0" w:space="0"/>
-        <w:right w:val="none" w:color="auto" w:sz="0" w:space="0"/>
-        <w:insideH w:val="none" w:color="auto" w:sz="0" w:space="0"/>
-        <w:insideV w:val="none" w:color="auto" w:sz="0" w:space="0"/>
-      </w:tblBorders>
-      <w:tblLayout w:type="fixed"/>
-      <w:tblCellMar>
-        <w:top w:w="0" w:type="dxa"/>
-        <w:left w:w="108" w:type="dxa"/>
-        <w:bottom w:w="0" w:type="dxa"/>
-        <w:right w:w="108" w:type="dxa"/>
-      </w:tblCellMar>
-    </w:tblPr>
-    <w:tblGrid>
-      <w:gridCol w:w="6104"/>
-      <w:gridCol w:w="1113"/>
-      <w:gridCol w:w="850"/>
-      <w:gridCol w:w="2725"/>
-    </w:tblGrid>
-    <w:tr>
-      <w:tblPrEx>
-        <w:tblBorders>
-          <w:top w:val="none" w:color="auto" w:sz="0" w:space="0"/>
-          <w:left w:val="none" w:color="auto" w:sz="0" w:space="0"/>
-          <w:bottom w:val="none" w:color="auto" w:sz="0" w:space="0"/>
-          <w:right w:val="none" w:color="auto" w:sz="0" w:space="0"/>
-          <w:insideH w:val="none" w:color="auto" w:sz="0" w:space="0"/>
-          <w:insideV w:val="none" w:color="auto" w:sz="0" w:space="0"/>
-        </w:tblBorders>
-        <w:tblCellMar>
-          <w:top w:w="0" w:type="dxa"/>
-          <w:left w:w="108" w:type="dxa"/>
-          <w:bottom w:w="0" w:type="dxa"/>
-          <w:right w:w="108" w:type="dxa"/>
-        </w:tblCellMar>
-      </w:tblPrEx>
-      <w:trPr>
-        <w:trHeight w:val="329" w:hRule="atLeast"/>
-      </w:trPr>
-      <w:tc>
-        <w:tcPr>
-          <w:tcW w:w="6104" w:type="dxa"/>
-          <w:tcBorders>
-            <w:tl2br w:val="nil"/>
-            <w:tr2bl w:val="nil"/>
-          </w:tcBorders>
-          <w:vAlign w:val="bottom"/>
-        </w:tcPr>
-        <w:p>
-          <w:pPr>
-            <w:pStyle w:val="10"/>
-            <w:jc w:val="both"/>
-            <w:rPr>
-              <w:rFonts w:ascii="Arial" w:hAnsi="Arial" w:cs="Arial"/>
-              <w:sz w:val="12"/>
-              <w:szCs w:val="12"/>
-            </w:rPr>
-          </w:pPr>
-          <w:r>
-            <w:rPr>
-              <w:rFonts w:ascii="Arial" w:hAnsi="Arial" w:cs="Arial"/>
-              <w:sz w:val="12"/>
-              <w:szCs w:val="12"/>
-            </w:rPr>
-            <w:fldChar w:fldCharType="begin"/>
-          </w:r>
-          <w:r>
-            <w:rPr>
-              <w:rFonts w:ascii="Arial" w:hAnsi="Arial" w:cs="Arial"/>
-              <w:sz w:val="12"/>
-              <w:szCs w:val="12"/>
-            </w:rPr>
-            <w:instrText xml:space="preserve"> FILENAME \p </w:instrText>
-          </w:r>
-          <w:r>
-            <w:rPr>
-              <w:rFonts w:ascii="Arial" w:hAnsi="Arial" w:cs="Arial"/>
-              <w:sz w:val="12"/>
-              <w:szCs w:val="12"/>
-            </w:rPr>
-            <w:fldChar w:fldCharType="separate"/>
-          </w:r>
-          <w:r>
-            <w:rPr>
-              <w:rFonts w:ascii="Arial" w:hAnsi="Arial" w:cs="Arial"/>
-              <w:sz w:val="12"/>
-              <w:szCs w:val="12"/>
-            </w:rPr>
-            <w:t>S:\SA\DeMasiP - 00328\Educational\Facesheet\DeMasi, P FaceSheet 1.8.21.doc</w:t>
-          </w:r>
-          <w:r>
-            <w:rPr>
-              <w:rFonts w:ascii="Arial" w:hAnsi="Arial" w:cs="Arial"/>
-              <w:sz w:val="12"/>
-              <w:szCs w:val="12"/>
-            </w:rPr>
-            <w:fldChar w:fldCharType="end"/>
-          </w:r>
-        </w:p>
-        <w:p>
-          <w:pPr>
-            <w:pStyle w:val="10"/>
-            <w:jc w:val="both"/>
-          </w:pPr>
-          <w:r>
-            <w:rPr>
-              <w:rFonts w:ascii="Arial" w:hAnsi="Arial" w:cs="Arial"/>
-              <w:sz w:val="12"/>
-              <w:szCs w:val="12"/>
-            </w:rPr>
-            <w:t>© Melmark New England Inc. 2005.  May not be used without written permission.</w:t>
-          </w:r>
-          <w:r>
-            <w:t xml:space="preserve"> </w:t>
-          </w:r>
-        </w:p>
-        <w:p>
-          <w:pPr>
-            <w:pStyle w:val="10"/>
-            <w:jc w:val="both"/>
-          </w:pPr>
-          <w:r>
-            <w:rPr>
-              <w:rFonts w:ascii="Arial" w:hAnsi="Arial" w:cs="Arial"/>
-              <w:sz w:val="12"/>
-              <w:szCs w:val="12"/>
-            </w:rPr>
-            <w:t>t6v2 5.05</w:t>
-          </w:r>
-        </w:p>
-      </w:tc>
-      <w:tc>
-        <w:tcPr>
-          <w:tcW w:w="1113" w:type="dxa"/>
-          <w:tcBorders>
-            <w:tl2br w:val="nil"/>
-            <w:tr2bl w:val="nil"/>
-          </w:tcBorders>
-          <w:vAlign w:val="bottom"/>
-        </w:tcPr>
-        <w:p>
-          <w:pPr>
-            <w:pStyle w:val="10"/>
-            <w:jc w:val="right"/>
-            <w:rPr>
-              <w:rFonts w:ascii="Arial Black" w:hAnsi="Arial Black"/>
-              <w:i/>
-              <w:sz w:val="24"/>
-            </w:rPr>
-          </w:pPr>
-          <w:r>
-            <w:rPr>
-              <w:rFonts w:ascii="Arial" w:hAnsi="Arial" w:cs="Arial"/>
-              <w:sz w:val="12"/>
-              <w:szCs w:val="12"/>
-            </w:rPr>
-            <w:t>Updated</w:t>
-          </w:r>
-          <w:r>
-            <w:rPr>
-              <w:rFonts w:hint="default" w:ascii="Arial" w:hAnsi="Arial" w:cs="Arial"/>
-              <w:sz w:val="12"/>
-              <w:szCs w:val="12"/>
-              <w:lang w:val="en-US"/>
-            </w:rPr>
-            <w:t>:</w:t>
-          </w:r>
-          <w:r>
-            <w:rPr>
-              <w:rFonts w:ascii="Arial" w:hAnsi="Arial" w:cs="Arial"/>
-              <w:sz w:val="12"/>
-              <w:szCs w:val="12"/>
-            </w:rPr>
-            <w:t xml:space="preserve"> </w:t>
-          </w:r>
-        </w:p>
-      </w:tc>
-      <w:tc>
-        <w:tcPr>
-          <w:tcW w:w="850" w:type="dxa"/>
-          <w:tcBorders>
-            <w:tl2br w:val="nil"/>
-            <w:tr2bl w:val="nil"/>
-          </w:tcBorders>
-          <w:vAlign w:val="bottom"/>
-        </w:tcPr>
-        <w:p>
-          <w:pPr>
-            <w:pStyle w:val="10"/>
-            <w:jc w:val="left"/>
-            <w:rPr>
-              <w:rFonts w:ascii="Arial Black" w:hAnsi="Arial Black" w:cs="Arial"/>
-              <w:i/>
-              <w:sz w:val="24"/>
-              <w:szCs w:val="24"/>
-            </w:rPr>
-          </w:pPr>
-          <w:r>
-            <w:rPr>
-              <w:rFonts w:ascii="Arial" w:hAnsi="Arial" w:cs="Arial"/>
-              <w:sz w:val="12"/>
-            </w:rPr>
-            <w:t>plcUpdated</w:t>
-          </w:r>
-        </w:p>
-      </w:tc>
-      <w:tc>
-        <w:tcPr>
-          <w:tcW w:w="2725" w:type="dxa"/>
-          <w:tcBorders>
-            <w:tl2br w:val="nil"/>
-            <w:tr2bl w:val="nil"/>
-          </w:tcBorders>
-          <w:vAlign w:val="bottom"/>
-        </w:tcPr>
-        <w:p>
-          <w:pPr>
-            <w:pStyle w:val="10"/>
-            <w:jc w:val="right"/>
-            <w:rPr>
-              <w:rFonts w:ascii="Arial" w:hAnsi="Arial" w:cs="Arial"/>
-              <w:sz w:val="12"/>
-              <w:szCs w:val="12"/>
-            </w:rPr>
-          </w:pPr>
-          <w:r>
-            <w:rPr>
-              <w:rFonts w:ascii="Arial" w:hAnsi="Arial" w:cs="Arial"/>
-              <w:sz w:val="12"/>
-              <w:szCs w:val="12"/>
-            </w:rPr>
-            <w:t xml:space="preserve">Printed </w:t>
-          </w:r>
-          <w:r>
-            <w:rPr>
-              <w:rFonts w:ascii="Arial" w:hAnsi="Arial" w:cs="Arial"/>
-              <w:sz w:val="12"/>
-              <w:szCs w:val="12"/>
-            </w:rPr>
-            <w:fldChar w:fldCharType="begin"/>
-          </w:r>
-          <w:r>
-            <w:rPr>
-              <w:rFonts w:ascii="Arial" w:hAnsi="Arial" w:cs="Arial"/>
-              <w:sz w:val="12"/>
-              <w:szCs w:val="12"/>
-            </w:rPr>
-            <w:instrText xml:space="preserve"> DATE \@ "M/d/yyyy" </w:instrText>
-          </w:r>
-          <w:r>
-            <w:rPr>
-              <w:rFonts w:ascii="Arial" w:hAnsi="Arial" w:cs="Arial"/>
-              <w:sz w:val="12"/>
-              <w:szCs w:val="12"/>
-            </w:rPr>
-            <w:fldChar w:fldCharType="separate"/>
-          </w:r>
-          <w:r>
-            <w:rPr>
-              <w:rFonts w:ascii="Arial" w:hAnsi="Arial" w:cs="Arial"/>
-              <w:sz w:val="12"/>
-              <w:szCs w:val="12"/>
-            </w:rPr>
-            <w:t>3/16/2022</w:t>
-          </w:r>
-          <w:r>
-            <w:rPr>
-              <w:rFonts w:ascii="Arial" w:hAnsi="Arial" w:cs="Arial"/>
-              <w:sz w:val="12"/>
-              <w:szCs w:val="12"/>
-            </w:rPr>
-            <w:fldChar w:fldCharType="end"/>
-          </w:r>
-        </w:p>
-      </w:tc>
-    </w:tr>
-  </w:tbl>
+  <w:p>
+    <w:pPr>
+      <w:pStyle w:val="10"/>
+      <w:jc w:val="both"/>
+      <w:rPr>
+        <w:rFonts w:ascii="Arial" w:hAnsi="Arial" w:cs="Arial"/>
+        <w:sz w:val="12"/>
+        <w:szCs w:val="12"/>
+      </w:rPr>
+    </w:pPr>
+  </w:p>
   <w:p>
     <w:pPr>
       <w:pStyle w:val="9"/>
-      <w:pBdr>
-        <w:top w:val="thickThinSmallGap" w:color="auto" w:sz="24" w:space="1"/>
-      </w:pBdr>
       <w:tabs>
         <w:tab w:val="right" w:pos="10800"/>
+        <w:tab w:val="clear" w:pos="4320"/>
         <w:tab w:val="clear" w:pos="8640"/>
       </w:tabs>
       <w:rPr>
-        <w:rFonts w:ascii="Arial" w:hAnsi="Arial" w:cs="Arial"/>
+        <w:rFonts w:hint="default" w:ascii="Arial" w:hAnsi="Arial" w:cs="Arial"/>
+        <w:sz w:val="12"/>
+        <w:szCs w:val="12"/>
+        <w:lang w:val="en-US"/>
       </w:rPr>
     </w:pPr>
     <w:r>
       <w:rPr>
         <w:rFonts w:ascii="Arial" w:hAnsi="Arial" w:cs="Arial"/>
+        <w:sz w:val="12"/>
+        <w:szCs w:val="12"/>
       </w:rPr>
-      <w:t>461 River Rd. | Andover, MA | 01810</w:t>
+      <w:t>© Melmark Inc. 2005,2026.  May not be used without written permission.</w:t>
     </w:r>
     <w:r>
       <w:rPr>
-        <w:rFonts w:ascii="Arial" w:hAnsi="Arial" w:cs="Arial"/>
+        <w:rFonts w:hint="default" w:ascii="Arial" w:hAnsi="Arial" w:cs="Arial"/>
+        <w:sz w:val="12"/>
+        <w:szCs w:val="12"/>
+        <w:lang w:val="en-US"/>
       </w:rPr>
       <w:tab/>
     </w:r>
     <w:r>
       <w:rPr>
-        <w:rFonts w:ascii="Arial" w:hAnsi="Arial" w:cs="Arial"/>
+        <w:rFonts w:hint="default" w:ascii="Arial" w:hAnsi="Arial" w:cs="Arial"/>
+        <w:sz w:val="12"/>
+        <w:szCs w:val="12"/>
+        <w:lang w:val="en-US"/>
       </w:rPr>
-      <w:tab/>
+      <w:t xml:space="preserve">                                                                                                                                                  </w:t>
     </w:r>
     <w:r>
       <w:rPr>
         <w:rFonts w:ascii="Arial" w:hAnsi="Arial" w:cs="Arial"/>
+        <w:sz w:val="12"/>
+        <w:szCs w:val="12"/>
       </w:rPr>
-      <w:t xml:space="preserve">(978) 654- 4300 </w:t>
+      <w:t xml:space="preserve">Printed </w:t>
+    </w:r>
+    <w:r>
+      <w:rPr>
+        <w:rFonts w:ascii="Arial" w:hAnsi="Arial" w:cs="Arial"/>
+        <w:sz w:val="12"/>
+        <w:szCs w:val="12"/>
+      </w:rPr>
+      <w:fldChar w:fldCharType="begin"/>
+    </w:r>
+    <w:r>
+      <w:rPr>
+        <w:rFonts w:ascii="Arial" w:hAnsi="Arial" w:cs="Arial"/>
+        <w:sz w:val="12"/>
+        <w:szCs w:val="12"/>
+      </w:rPr>
+      <w:instrText xml:space="preserve"> DATE \@ "M/d/yyyy"</w:instrText>
+    </w:r>
+    <w:r>
+      <w:rPr>
+        <w:rFonts w:ascii="Arial" w:hAnsi="Arial" w:cs="Arial"/>
+        <w:sz w:val="12"/>
+        <w:szCs w:val="12"/>
+      </w:rPr>
+      <w:fldChar w:fldCharType="separate"/>
+    </w:r>
+    <w:r>
+      <w:rPr>
+        <w:rFonts w:ascii="Arial" w:hAnsi="Arial" w:cs="Arial"/>
+        <w:sz w:val="12"/>
+        <w:szCs w:val="12"/>
+      </w:rPr>
+      <w:t>5/6/2026</w:t>
+    </w:r>
+    <w:r>
+      <w:rPr>
+        <w:rFonts w:ascii="Arial" w:hAnsi="Arial" w:cs="Arial"/>
+        <w:sz w:val="12"/>
+        <w:szCs w:val="12"/>
+      </w:rPr>
+      <w:fldChar w:fldCharType="end"/>
+    </w:r>
+    <w:r>
+      <w:rPr>
+        <w:rFonts w:hint="default" w:ascii="Arial" w:hAnsi="Arial" w:cs="Arial"/>
+        <w:sz w:val="12"/>
+        <w:szCs w:val="12"/>
+        <w:lang w:val="en-US"/>
+      </w:rPr>
+      <w:tab/>
     </w:r>
   </w:p>
   <w:p>
@@ -7518,12 +7351,6 @@
       <w:rPr>
         <w:rFonts w:ascii="Arial" w:hAnsi="Arial" w:cs="Arial"/>
       </w:rPr>
-      <w:t>www.melmarkne.org</w:t>
-    </w:r>
-    <w:r>
-      <w:rPr>
-        <w:rFonts w:ascii="Arial" w:hAnsi="Arial" w:cs="Arial"/>
-      </w:rPr>
       <w:tab/>
     </w:r>
     <w:r>
@@ -7532,12 +7359,8 @@
       </w:rPr>
       <w:tab/>
     </w:r>
-    <w:r>
-      <w:rPr>
-        <w:rFonts w:ascii="Arial" w:hAnsi="Arial" w:cs="Arial"/>
-      </w:rPr>
-      <w:t>(978) 654- 4315 fax</w:t>
-    </w:r>
+    <w:bookmarkStart w:id="0" w:name="_GoBack"/>
+    <w:bookmarkEnd w:id="0"/>
   </w:p>
 </w:ftr>
 </file>
@@ -7602,25 +7425,24 @@
             <w:pStyle w:val="10"/>
             <w:ind w:left="-21"/>
             <w:rPr>
-              <w:rFonts w:ascii="Arial" w:hAnsi="Arial" w:cs="Arial"/>
+              <w:rFonts w:hint="default" w:ascii="Arial" w:hAnsi="Arial" w:cs="Arial"/>
               <w:sz w:val="28"/>
               <w:szCs w:val="28"/>
+              <w:lang w:val="en-US"/>
             </w:rPr>
           </w:pPr>
           <w:r>
+            <w:rPr>
+              <w:rFonts w:hint="default" w:ascii="Arial" w:hAnsi="Arial" w:cs="Arial"/>
+              <w:sz w:val="28"/>
+              <w:szCs w:val="28"/>
+              <w:lang w:val="en-US"/>
+            </w:rPr>
             <w:drawing>
-              <wp:anchor distT="0" distB="0" distL="0" distR="0" simplePos="0" relativeHeight="251660288" behindDoc="0" locked="0" layoutInCell="1" allowOverlap="1">
-                <wp:simplePos x="0" y="0"/>
-                <wp:positionH relativeFrom="column">
-                  <wp:posOffset>-13335</wp:posOffset>
-                </wp:positionH>
-                <wp:positionV relativeFrom="paragraph">
-                  <wp:posOffset>52705</wp:posOffset>
-                </wp:positionV>
-                <wp:extent cx="1181100" cy="352425"/>
-                <wp:effectExtent l="0" t="0" r="0" b="9525"/>
-                <wp:wrapNone/>
-                <wp:docPr id="10" name="Picture 10" descr="MelmarkNE stacked 1"/>
+              <wp:inline distT="0" distB="0" distL="114300" distR="114300">
+                <wp:extent cx="1184910" cy="346710"/>
+                <wp:effectExtent l="0" t="0" r="15240" b="15240"/>
+                <wp:docPr id="4" name="Picture 4" descr="MELMARK LOGO"/>
                 <wp:cNvGraphicFramePr>
                   <a:graphicFrameLocks xmlns:a="http://schemas.openxmlformats.org/drawingml/2006/main" noChangeAspect="1"/>
                 </wp:cNvGraphicFramePr>
@@ -7628,14 +7450,13 @@
                   <a:graphicData uri="http://schemas.openxmlformats.org/drawingml/2006/picture">
                     <pic:pic xmlns:pic="http://schemas.openxmlformats.org/drawingml/2006/picture">
                       <pic:nvPicPr>
-                        <pic:cNvPr id="10" name="Picture 10" descr="MelmarkNE stacked 1"/>
+                        <pic:cNvPr id="4" name="Picture 4" descr="MELMARK LOGO"/>
                         <pic:cNvPicPr>
-                          <a:picLocks noChangeAspect="1" noChangeArrowheads="1"/>
+                          <a:picLocks noChangeAspect="1"/>
                         </pic:cNvPicPr>
                       </pic:nvPicPr>
                       <pic:blipFill>
                         <a:blip r:embed="rId1"/>
-                        <a:srcRect/>
                         <a:stretch>
                           <a:fillRect/>
                         </a:stretch>
@@ -7643,23 +7464,16 @@
                       <pic:spPr>
                         <a:xfrm>
                           <a:off x="0" y="0"/>
-                          <a:ext cx="1181100" cy="352425"/>
+                          <a:ext cx="1184910" cy="346710"/>
                         </a:xfrm>
                         <a:prstGeom prst="rect">
                           <a:avLst/>
                         </a:prstGeom>
-                        <a:noFill/>
-                        <a:ln w="9525">
-                          <a:noFill/>
-                          <a:miter lim="800000"/>
-                          <a:headEnd/>
-                          <a:tailEnd/>
-                        </a:ln>
                       </pic:spPr>
                     </pic:pic>
                   </a:graphicData>
                 </a:graphic>
-              </wp:anchor>
+              </wp:inline>
             </w:drawing>
           </w:r>
         </w:p>
@@ -7687,7 +7501,7 @@
               <w:sz w:val="28"/>
               <w:szCs w:val="28"/>
             </w:rPr>
-            <w:t>Student Face Sheet</w:t>
+            <w:t>Face Sheet</w:t>
           </w:r>
         </w:p>
       </w:tc>
@@ -7738,7 +7552,6 @@
         <w:p>
           <w:pPr>
             <w:pStyle w:val="10"/>
-            <w:ind w:firstLine="0" w:firstLineChars="0"/>
             <w:jc w:val="right"/>
             <w:rPr>
               <w:rFonts w:ascii="Arial Black" w:hAnsi="Arial Black" w:cs="Arial"/>
@@ -7766,7 +7579,6 @@
         <w:p>
           <w:pPr>
             <w:pStyle w:val="10"/>
-            <w:ind w:firstLine="0" w:firstLineChars="0"/>
             <w:jc w:val="right"/>
             <w:rPr>
               <w:rFonts w:ascii="Arial Black" w:hAnsi="Arial Black" w:cs="Arial"/>
@@ -7794,23 +7606,6 @@
         <w:p>
           <w:pPr>
             <w:pStyle w:val="10"/>
-            <w:keepNext w:val="0"/>
-            <w:keepLines w:val="0"/>
-            <w:pageBreakBefore w:val="0"/>
-            <w:widowControl/>
-            <w:kinsoku/>
-            <w:wordWrap/>
-            <w:overflowPunct w:val="0"/>
-            <w:topLinePunct w:val="0"/>
-            <w:autoSpaceDE w:val="0"/>
-            <w:autoSpaceDN w:val="0"/>
-            <w:bidi w:val="0"/>
-            <w:adjustRightInd w:val="0"/>
-            <w:snapToGrid/>
-            <w:spacing w:line="240" w:lineRule="auto"/>
-            <w:ind w:firstLine="0" w:firstLineChars="0"/>
-            <w:jc w:val="left"/>
-            <w:textAlignment w:val="baseline"/>
             <w:rPr>
               <w:rFonts w:ascii="Arial Black" w:hAnsi="Arial Black" w:cs="Arial"/>
               <w:i/>
@@ -7878,6 +7673,12 @@
           <w:insideH w:val="none" w:color="auto" w:sz="0" w:space="0"/>
           <w:insideV w:val="none" w:color="auto" w:sz="0" w:space="0"/>
         </w:tblBorders>
+        <w:tblCellMar>
+          <w:top w:w="0" w:type="dxa"/>
+          <w:left w:w="108" w:type="dxa"/>
+          <w:bottom w:w="0" w:type="dxa"/>
+          <w:right w:w="108" w:type="dxa"/>
+        </w:tblCellMar>
       </w:tblPrEx>
       <w:trPr>
         <w:trHeight w:val="253" w:hRule="atLeast"/>
@@ -7893,25 +7694,24 @@
             <w:pStyle w:val="10"/>
             <w:ind w:left="-21"/>
             <w:rPr>
-              <w:rFonts w:ascii="Arial" w:hAnsi="Arial" w:cs="Arial"/>
+              <w:rFonts w:hint="default" w:ascii="Arial" w:hAnsi="Arial" w:cs="Arial"/>
               <w:sz w:val="28"/>
               <w:szCs w:val="28"/>
+              <w:lang w:val="en-US"/>
             </w:rPr>
           </w:pPr>
           <w:r>
+            <w:rPr>
+              <w:rFonts w:hint="default" w:ascii="Arial" w:hAnsi="Arial" w:cs="Arial"/>
+              <w:sz w:val="28"/>
+              <w:szCs w:val="28"/>
+              <w:lang w:val="en-US"/>
+            </w:rPr>
             <w:drawing>
-              <wp:anchor distT="0" distB="0" distL="0" distR="0" simplePos="0" relativeHeight="251659264" behindDoc="0" locked="0" layoutInCell="1" allowOverlap="1">
-                <wp:simplePos x="0" y="0"/>
-                <wp:positionH relativeFrom="column">
-                  <wp:posOffset>-13335</wp:posOffset>
-                </wp:positionH>
-                <wp:positionV relativeFrom="paragraph">
-                  <wp:posOffset>52705</wp:posOffset>
-                </wp:positionV>
-                <wp:extent cx="1181100" cy="352425"/>
-                <wp:effectExtent l="0" t="0" r="0" b="9525"/>
-                <wp:wrapNone/>
-                <wp:docPr id="1" name="Picture 1" descr="MelmarkNE stacked 1"/>
+              <wp:inline distT="0" distB="0" distL="114300" distR="114300">
+                <wp:extent cx="1184910" cy="346710"/>
+                <wp:effectExtent l="0" t="0" r="15240" b="15240"/>
+                <wp:docPr id="2" name="Picture 2" descr="MELMARK LOGO"/>
                 <wp:cNvGraphicFramePr>
                   <a:graphicFrameLocks xmlns:a="http://schemas.openxmlformats.org/drawingml/2006/main" noChangeAspect="1"/>
                 </wp:cNvGraphicFramePr>
@@ -7919,14 +7719,13 @@
                   <a:graphicData uri="http://schemas.openxmlformats.org/drawingml/2006/picture">
                     <pic:pic xmlns:pic="http://schemas.openxmlformats.org/drawingml/2006/picture">
                       <pic:nvPicPr>
-                        <pic:cNvPr id="1" name="Picture 1" descr="MelmarkNE stacked 1"/>
+                        <pic:cNvPr id="2" name="Picture 2" descr="MELMARK LOGO"/>
                         <pic:cNvPicPr>
-                          <a:picLocks noChangeAspect="1" noChangeArrowheads="1"/>
+                          <a:picLocks noChangeAspect="1"/>
                         </pic:cNvPicPr>
                       </pic:nvPicPr>
                       <pic:blipFill>
                         <a:blip r:embed="rId1"/>
-                        <a:srcRect/>
                         <a:stretch>
                           <a:fillRect/>
                         </a:stretch>
@@ -7934,23 +7733,16 @@
                       <pic:spPr>
                         <a:xfrm>
                           <a:off x="0" y="0"/>
-                          <a:ext cx="1181100" cy="352425"/>
+                          <a:ext cx="1184910" cy="346710"/>
                         </a:xfrm>
                         <a:prstGeom prst="rect">
                           <a:avLst/>
                         </a:prstGeom>
-                        <a:noFill/>
-                        <a:ln w="9525">
-                          <a:noFill/>
-                          <a:miter lim="800000"/>
-                          <a:headEnd/>
-                          <a:tailEnd/>
-                        </a:ln>
                       </pic:spPr>
                     </pic:pic>
                   </a:graphicData>
                 </a:graphic>
-              </wp:anchor>
+              </wp:inline>
             </w:drawing>
           </w:r>
         </w:p>
@@ -7978,7 +7770,7 @@
               <w:sz w:val="28"/>
               <w:szCs w:val="28"/>
             </w:rPr>
-            <w:t>Student Face Sheet</w:t>
+            <w:t xml:space="preserve"> Face Sheet</w:t>
           </w:r>
         </w:p>
       </w:tc>
@@ -8029,7 +7821,6 @@
         <w:p>
           <w:pPr>
             <w:pStyle w:val="10"/>
-            <w:ind w:firstLine="0" w:firstLineChars="0"/>
             <w:jc w:val="right"/>
             <w:rPr>
               <w:rFonts w:ascii="Arial Black" w:hAnsi="Arial Black" w:cs="Arial"/>
@@ -8057,7 +7848,6 @@
         <w:p>
           <w:pPr>
             <w:pStyle w:val="10"/>
-            <w:ind w:firstLine="0" w:firstLineChars="0"/>
             <w:jc w:val="right"/>
             <w:rPr>
               <w:rFonts w:ascii="Arial Black" w:hAnsi="Arial Black" w:cs="Arial"/>
@@ -8085,23 +7875,6 @@
         <w:p>
           <w:pPr>
             <w:pStyle w:val="10"/>
-            <w:keepNext w:val="0"/>
-            <w:keepLines w:val="0"/>
-            <w:pageBreakBefore w:val="0"/>
-            <w:widowControl/>
-            <w:kinsoku/>
-            <w:wordWrap/>
-            <w:overflowPunct w:val="0"/>
-            <w:topLinePunct w:val="0"/>
-            <w:autoSpaceDE w:val="0"/>
-            <w:autoSpaceDN w:val="0"/>
-            <w:bidi w:val="0"/>
-            <w:adjustRightInd w:val="0"/>
-            <w:snapToGrid/>
-            <w:spacing w:line="240" w:lineRule="auto"/>
-            <w:ind w:firstLine="0" w:firstLineChars="0"/>
-            <w:jc w:val="left"/>
-            <w:textAlignment w:val="baseline"/>
             <w:rPr>
               <w:rFonts w:ascii="Arial Black" w:hAnsi="Arial Black" w:cs="Arial"/>
               <w:i/>
@@ -8295,7 +8068,7 @@
   <w:docDefaults>
     <w:rPrDefault>
       <w:rPr>
-        <w:rFonts w:ascii="Times New Roman" w:hAnsi="Times New Roman" w:eastAsia="Times New Roman" w:cs="Times New Roman"/>
+        <w:rFonts w:ascii="Times New Roman" w:hAnsi="Times New Roman" w:eastAsia="SimSun" w:cs="Times New Roman"/>
       </w:rPr>
     </w:rPrDefault>
     <w:pPrDefault/>
@@ -8808,6 +8581,7 @@
   <w:style w:type="paragraph" w:customStyle="1" w:styleId="19">
     <w:name w:val="M Table Help Outside"/>
     <w:basedOn w:val="1"/>
+    <w:qFormat/>
     <w:uiPriority w:val="0"/>
     <w:pPr>
       <w:keepNext/>
@@ -8836,6 +8610,7 @@
   <w:style w:type="paragraph" w:customStyle="1" w:styleId="21">
     <w:name w:val="M Table Text Bold"/>
     <w:basedOn w:val="20"/>
+    <w:qFormat/>
     <w:uiPriority w:val="0"/>
     <w:rPr>
       <w:rFonts w:ascii="Arial" w:hAnsi="Arial"/>

</xml_diff>